<commit_message>
Concept Profile and Rough Draft: same naming sweep (field investigation, immersion, sharpening record)
Co-Authored-By: Claude Opus 5 (1M context) <noreply@anthropic.com>
</commit_message>
<xml_diff>
--- a/week-13-final-report/week-13-rough-draft.docx
+++ b/week-13-final-report/week-13-rough-draft.docx
@@ -116,7 +116,7 @@
           <w:sz w:val="22"/>
           <w:szCs w:val="22"/>
         </w:rPr>
-        <w:t xml:space="preserve">You already have a start: your question commentary from Week 7, your lesson plan from Week 10, your collected data write-up from the first session of Week 13. We'll spend time in each class meeting drafting a full rough draft using these preexisting notes. </w:t>
+        <w:t xml:space="preserve">You already have a start: your sharpening record from Week 7, your lesson plan from Week 10, your collected data write-up from the first session of Week 13. We'll spend time in each class meeting drafting a full rough draft using these preexisting notes. </w:t>
       </w:r>
     </w:p>
     <w:p>
@@ -353,7 +353,7 @@
           <w:sz w:val="22"/>
           <w:szCs w:val="22"/>
         </w:rPr>
-        <w:t>You are helping me draft the Question section of a paper for my math-teaching methods course; the paper reports a small field investigation into how a student understands one math concept. The section (150–250 words) should state my guiding question, name the concept behind it, say who my student was (grade and relevant context, pseudonym only), and why the question mattered to me as a teacher. My raw material: [paste your Week 7 question commentary and notes on your concept and student]. Work in two steps: first, ask me up to three questions about anything unclear or missing; then draft the section in my own first-person voice — plain, direct prose, no filler — and after the draft, list where you had to guess so I can check it. Use only what I give you; do not invent anything about my student, my teaching, or my results.</w:t>
+        <w:t>You are helping me draft the Question section of a paper for my math-teaching methods course; the paper reports a small field investigation into how a student understands one math concept. The section (150–250 words) should state my guiding question, name the concept behind it, say who my student was (grade and relevant context, pseudonym only), and why the question mattered to me as a teacher. My raw material: [paste your Week 7 sharpening record and notes on your concept and student]. Work in two steps: first, ask me up to three questions about anything unclear or missing; then draft the section in my own first-person voice — plain, direct prose, no filler — and after the draft, list where you had to guess so I can check it. Use only what I give you; do not invent anything about my student, my teaching, or my results.</w:t>
       </w:r>
     </w:p>
     <w:p>

</xml_diff>